<commit_message>
fix: final consistency pass - docs, validator, tests, CI, DOCX
- generate_experiment_summary.py: auto-generate EXPERIMENT_SUMMARY.md from CSVs
- EXPERIMENT_SUMMARY.md: rebuilt from CSV data (12940 rows, 9 CSVs, 5 protocols)
- paper_data/README.md: rewritten with accurate row counts and environment
- README.md: updated summary source to paper_data
- paper/main_zh.md: full revision (5 protocols, 8 attacks, 2 attacker models, localhost)
- paper/build_mdpi_chinese_docx.py: fixed old numbers (3600→7200, Linux→localhost)
- paper/GMCP-R_MDPI_Electronics_中文初稿.docx: regenerated
- paper/generated_figures/: regenerated baseline figures
- validate_submission_revision.py: denominator uses applicable+injected+sent
- validate_release_artifacts.py: new release artifact validator
- tests/test_experiment_contracts.py: +8 new tests (116 total)
- .github/workflows/ci.yml: new CI workflow

CSV SHA-256 verified unchanged before and after all changes.
</commit_message>
<xml_diff>
--- a/paper/GMCP-R_MDPI_Electronics_中文初稿.docx
+++ b/paper/GMCP-R_MDPI_Electronics_中文初稿.docx
@@ -4508,7 +4508,7 @@
                 <w:b w:val="0"/>
                 <w:sz w:val="18"/>
               </w:rPr>
-              <w:t>Linux Ubuntu 22.04，4 核 CPU，4GB 内存，VPC 网络</w:t>
+              <w:t>Python 3.11，同一主机 TCP loopback（127.0.0.1:9000/9001）</w:t>
             </w:r>
           </w:p>
         </w:tc>
@@ -4889,7 +4889,7 @@
           <w:b w:val="0"/>
           <w:color w:val="000000"/>
         </w:rPr>
-        <w:t>Python TCP baseline 对比实验覆盖 4 种协议、5 类攻击类型、3 种消息数量、2 种载荷大小与 30 次重复，共 3,600 条记录。MemoryTicket 无效票据实验覆盖 5 类无效票据、2 种消息数量与 30 次重复，共 300 条记录。攻击/断连恢复实验覆盖 5 类场景、3 种消息数量、2 种载荷大小与 30 次重复，共 900 条记录。弱网仿真覆盖 3 种协议、5 档丢包率、5 档延迟与每条件 2 次重复，结果作为初步恢复能力验证，而非操作系统级网络损伤结论。</w:t>
+        <w:t>Python TCP baseline 对比实验覆盖 5 种协议、8 种攻击条件、3 种消息数量、2 种载荷大小与 30 次重复，共 7,200 条记录。MemoryTicket 无效票据实验覆盖 5 类无效票据、2 种消息数量与 30 次重复，共 300 条记录。性能基准实验覆盖 5 种协议、5 种负载大小、2 种消息数量与 30 次重复，共 1,200 条记录。并发实验覆盖 5 种并发等级与 30 次重复，共 150 条记录。攻击/断连恢复实验覆盖 5 类场景、3 种消息数量、2 种载荷大小与 30 次重复，共 900 条记录。弱网仿真覆盖 3 种协议、5 档丢包率、5 档延迟与每条件 2 次重复，共 150 条记录，结果作为初步代码级弱网验证。恢复窗口实验覆盖 5 种场景与 30 次重复，共 760 条记录。Checkpoint 成本实验覆盖 3 种会话长度、4 种间隔、3 种偏移与 30 次重复，共 2,160 条记录。总计 12,940 条数据。</w:t>
       </w:r>
     </w:p>
     <w:p>
@@ -5198,7 +5198,7 @@
                 <w:b w:val="0"/>
                 <w:sz w:val="18"/>
               </w:rPr>
-              <w:t>10,614</w:t>
+              <w:t>10,341</w:t>
             </w:r>
           </w:p>
         </w:tc>
@@ -5225,7 +5225,7 @@
                 <w:b w:val="0"/>
                 <w:sz w:val="18"/>
               </w:rPr>
-              <w:t>0.093</w:t>
+              <w:t>0.091</w:t>
             </w:r>
           </w:p>
         </w:tc>
@@ -5362,7 +5362,7 @@
                 <w:b w:val="0"/>
                 <w:sz w:val="18"/>
               </w:rPr>
-              <w:t>13,008</w:t>
+              <w:t>12,642</w:t>
             </w:r>
           </w:p>
         </w:tc>
@@ -5389,7 +5389,171 @@
                 <w:b w:val="0"/>
                 <w:sz w:val="18"/>
               </w:rPr>
-              <w:t>0.084</w:t>
+              <w:t>0.082</w:t>
+            </w:r>
+          </w:p>
+        </w:tc>
+        <w:tc>
+          <w:tcPr>
+            <w:tcW w:type="dxa" w:w="1450"/>
+            <w:vAlign w:val="center"/>
+            <w:tcMar>
+              <w:top w:w="80" w:type="dxa"/>
+              <w:bottom w:w="80" w:type="dxa"/>
+              <w:start w:w="120" w:type="dxa"/>
+              <w:end w:w="120" w:type="dxa"/>
+            </w:tcMar>
+          </w:tcPr>
+          <w:p>
+            <w:pPr>
+              <w:spacing w:before="0" w:after="0" w:line="276" w:lineRule="auto"/>
+              <w:jc w:val="center"/>
+            </w:pPr>
+            <w:r/>
+            <w:r>
+              <w:rPr>
+                <w:rFonts w:ascii="Calibri" w:hAnsi="Calibri" w:eastAsia="宋体"/>
+                <w:b w:val="0"/>
+                <w:sz w:val="18"/>
+              </w:rPr>
+              <w:t>100%</w:t>
+            </w:r>
+          </w:p>
+        </w:tc>
+        <w:tc>
+          <w:tcPr>
+            <w:tcW w:type="dxa" w:w="1450"/>
+            <w:vAlign w:val="center"/>
+            <w:tcMar>
+              <w:top w:w="80" w:type="dxa"/>
+              <w:bottom w:w="80" w:type="dxa"/>
+              <w:start w:w="120" w:type="dxa"/>
+              <w:end w:w="120" w:type="dxa"/>
+            </w:tcMar>
+          </w:tcPr>
+          <w:p>
+            <w:pPr>
+              <w:spacing w:before="0" w:after="0" w:line="276" w:lineRule="auto"/>
+              <w:jc w:val="center"/>
+            </w:pPr>
+            <w:r/>
+            <w:r>
+              <w:rPr>
+                <w:rFonts w:ascii="Calibri" w:hAnsi="Calibri" w:eastAsia="宋体"/>
+                <w:b w:val="0"/>
+                <w:sz w:val="18"/>
+              </w:rPr>
+              <w:t>0%</w:t>
+            </w:r>
+          </w:p>
+        </w:tc>
+        <w:tc>
+          <w:tcPr>
+            <w:tcW w:type="dxa" w:w="1510"/>
+            <w:vAlign w:val="center"/>
+            <w:tcMar>
+              <w:top w:w="80" w:type="dxa"/>
+              <w:bottom w:w="80" w:type="dxa"/>
+              <w:start w:w="120" w:type="dxa"/>
+              <w:end w:w="120" w:type="dxa"/>
+            </w:tcMar>
+          </w:tcPr>
+          <w:p>
+            <w:pPr>
+              <w:spacing w:before="0" w:after="0" w:line="276" w:lineRule="auto"/>
+              <w:jc w:val="center"/>
+            </w:pPr>
+            <w:r/>
+            <w:r>
+              <w:rPr>
+                <w:rFonts w:ascii="Calibri" w:hAnsi="Calibri" w:eastAsia="宋体"/>
+                <w:b w:val="0"/>
+                <w:sz w:val="18"/>
+              </w:rPr>
+              <w:t>0%</w:t>
+            </w:r>
+          </w:p>
+        </w:tc>
+      </w:tr>
+      <w:tr>
+        <w:tc>
+          <w:tcPr>
+            <w:tcW w:type="dxa" w:w="1500"/>
+            <w:vAlign w:val="center"/>
+            <w:tcMar>
+              <w:top w:w="80" w:type="dxa"/>
+              <w:bottom w:w="80" w:type="dxa"/>
+              <w:start w:w="120" w:type="dxa"/>
+              <w:end w:w="120" w:type="dxa"/>
+            </w:tcMar>
+          </w:tcPr>
+          <w:p>
+            <w:pPr>
+              <w:spacing w:before="0" w:after="0" w:line="276" w:lineRule="auto"/>
+              <w:jc w:val="center"/>
+            </w:pPr>
+            <w:r/>
+            <w:r>
+              <w:rPr>
+                <w:rFonts w:ascii="Calibri" w:hAnsi="Calibri" w:eastAsia="宋体"/>
+                <w:b w:val="0"/>
+                <w:sz w:val="18"/>
+              </w:rPr>
+              <w:t>Authenticated Hash Chain</w:t>
+            </w:r>
+          </w:p>
+        </w:tc>
+        <w:tc>
+          <w:tcPr>
+            <w:tcW w:type="dxa" w:w="1950"/>
+            <w:vAlign w:val="center"/>
+            <w:tcMar>
+              <w:top w:w="80" w:type="dxa"/>
+              <w:bottom w:w="80" w:type="dxa"/>
+              <w:start w:w="120" w:type="dxa"/>
+              <w:end w:w="120" w:type="dxa"/>
+            </w:tcMar>
+          </w:tcPr>
+          <w:p>
+            <w:pPr>
+              <w:spacing w:before="0" w:after="0" w:line="276" w:lineRule="auto"/>
+              <w:jc w:val="center"/>
+            </w:pPr>
+            <w:r/>
+            <w:r>
+              <w:rPr>
+                <w:rFonts w:ascii="Calibri" w:hAnsi="Calibri" w:eastAsia="宋体"/>
+                <w:b w:val="0"/>
+                <w:sz w:val="18"/>
+              </w:rPr>
+              <w:t>9,655</w:t>
+            </w:r>
+          </w:p>
+        </w:tc>
+        <w:tc>
+          <w:tcPr>
+            <w:tcW w:type="dxa" w:w="1500"/>
+            <w:vAlign w:val="center"/>
+            <w:tcMar>
+              <w:top w:w="80" w:type="dxa"/>
+              <w:bottom w:w="80" w:type="dxa"/>
+              <w:start w:w="120" w:type="dxa"/>
+              <w:end w:w="120" w:type="dxa"/>
+            </w:tcMar>
+          </w:tcPr>
+          <w:p>
+            <w:pPr>
+              <w:spacing w:before="0" w:after="0" w:line="276" w:lineRule="auto"/>
+              <w:jc w:val="center"/>
+            </w:pPr>
+            <w:r/>
+            <w:r>
+              <w:rPr>
+                <w:rFonts w:ascii="Calibri" w:hAnsi="Calibri" w:eastAsia="宋体"/>
+                <w:b w:val="0"/>
+                <w:sz w:val="18"/>
+              </w:rPr>
+              <w:t>0.098</w:t>
             </w:r>
           </w:p>
         </w:tc>
@@ -5526,7 +5690,7 @@
                 <w:b w:val="0"/>
                 <w:sz w:val="18"/>
               </w:rPr>
-              <w:t>13,148</w:t>
+              <w:t>12,760</w:t>
             </w:r>
           </w:p>
         </w:tc>
@@ -5553,7 +5717,7 @@
                 <w:b w:val="0"/>
                 <w:sz w:val="18"/>
               </w:rPr>
-              <w:t>0.080</w:t>
+              <w:t>0.082</w:t>
             </w:r>
           </w:p>
         </w:tc>
@@ -5580,7 +5744,7 @@
                 <w:b w:val="0"/>
                 <w:sz w:val="18"/>
               </w:rPr>
-              <w:t>75%</w:t>
+              <w:t>100%†</w:t>
             </w:r>
           </w:p>
         </w:tc>
@@ -5607,7 +5771,7 @@
                 <w:b w:val="0"/>
                 <w:sz w:val="18"/>
               </w:rPr>
-              <w:t>25%</w:t>
+              <w:t>0%</w:t>
             </w:r>
           </w:p>
         </w:tc>
@@ -5690,7 +5854,7 @@
                 <w:b w:val="0"/>
                 <w:sz w:val="18"/>
               </w:rPr>
-              <w:t>13,516</w:t>
+              <w:t>13,177</w:t>
             </w:r>
           </w:p>
         </w:tc>
@@ -5744,7 +5908,7 @@
                 <w:b w:val="0"/>
                 <w:sz w:val="18"/>
               </w:rPr>
-              <w:t>50%</w:t>
+              <w:t>83.3%</w:t>
             </w:r>
           </w:p>
         </w:tc>
@@ -5771,7 +5935,7 @@
                 <w:b w:val="0"/>
                 <w:sz w:val="18"/>
               </w:rPr>
-              <w:t>50%</w:t>
+              <w:t>16.7%</w:t>
             </w:r>
           </w:p>
         </w:tc>
@@ -5828,7 +5992,7 @@
           <w:b w:val="0"/>
           <w:color w:val="000000"/>
         </w:rPr>
-        <w:t>本节采用与表 6 一致的 v2 汇总口径报告描述性统计。可以看到，GMCP-R 与 Hash Chain 在测试攻击集合中的检测率均为 100%，而 Seq+MAC 和 Ticket Only 分别存在 25% 与 50% 的误接受率。考虑到当前 baseline 每个配置的重复次数仍较少，本稿暂不报告正式统计推断，后续扩展重复次数后再补充显著性检验。</w:t>
+        <w:t>本节采用从 paper_data/01_real_baseline.csv 自动统计的口径。GMCP-R、Hash Chain 和 Authenticated Hash Chain 在适用攻击中均达到 100% 检测率。Seq+MAC 在适用攻击中同样达到 100% 检测率（forged_prev_mem_valid_mac 不适用，标记为†）。Ticket Only 的检测率为 83.3%，误接受率为 16.7%。</w:t>
       </w:r>
     </w:p>
     <w:p>

</xml_diff>

<commit_message>
docs: sync paper, figures, DOCX with final 05 data
- paper/main_zh.md: updated abstract, attacker models, port descriptions,
  checkpoint repeats, performance, concurrency, weak network chapter
- paper/build_mdpi_chinese_docx.py: fixed weak network table (all 100%)
- Regenerated figures and DOCX
- DOCX verified clean of old strings
- 116 tests passing
</commit_message>
<xml_diff>
--- a/paper/GMCP-R_MDPI_Electronics_中文初稿.docx
+++ b/paper/GMCP-R_MDPI_Electronics_中文初稿.docx
@@ -4508,7 +4508,7 @@
                 <w:b w:val="0"/>
                 <w:sz w:val="18"/>
               </w:rPr>
-              <w:t>Python 3.11，同一主机 TCP loopback（127.0.0.1:9000/9001）</w:t>
+              <w:t>Python 3.11，同一主机 TCP loopback（localhost:9000 / 127.0.0.1:9001）</w:t>
             </w:r>
           </w:p>
         </w:tc>
@@ -4620,7 +4620,7 @@
                 <w:b w:val="0"/>
                 <w:sz w:val="18"/>
               </w:rPr>
-              <w:t>Hash Chain、Seq+MAC、Ticket Only</w:t>
+              <w:t>四种基线协议：Hash Chain、Authenticated Hash Chain、Seq+MAC、Ticket Only</w:t>
             </w:r>
           </w:p>
         </w:tc>
@@ -8971,7 +8971,7 @@
           <w:color w:val="000000"/>
           <w:sz w:val="19"/>
         </w:rPr>
-        <w:t>附录表 A1. 弱网仿真初步结果（25 种参数组合 x 2 次重复）</w:t>
+        <w:t>附录表 A1. 代码级发送丢弃与延迟实验（25 种参数组合 x 2 次重复）</w:t>
       </w:r>
     </w:p>
     <w:tbl>
@@ -9247,7 +9247,7 @@
                 <w:b w:val="0"/>
                 <w:sz w:val="18"/>
               </w:rPr>
-              <w:t>72.81</w:t>
+              <w:t>1159.5</w:t>
             </w:r>
           </w:p>
         </w:tc>
@@ -9274,7 +9274,7 @@
                 <w:b w:val="0"/>
                 <w:sz w:val="18"/>
               </w:rPr>
-              <w:t>79.90</w:t>
+              <w:t>20.3</w:t>
             </w:r>
           </w:p>
         </w:tc>
@@ -9330,7 +9330,7 @@
                 <w:b w:val="0"/>
                 <w:sz w:val="18"/>
               </w:rPr>
-              <w:t>0.18%</w:t>
+              <w:t>100.0%</w:t>
             </w:r>
           </w:p>
         </w:tc>
@@ -9357,7 +9357,7 @@
                 <w:b w:val="0"/>
                 <w:sz w:val="18"/>
               </w:rPr>
-              <w:t>0.24%</w:t>
+              <w:t>0.0%</w:t>
             </w:r>
           </w:p>
         </w:tc>
@@ -9384,7 +9384,7 @@
                 <w:b w:val="0"/>
                 <w:sz w:val="18"/>
               </w:rPr>
-              <w:t>0.00</w:t>
+              <w:t>1113.7</w:t>
             </w:r>
           </w:p>
         </w:tc>
@@ -9411,7 +9411,7 @@
                 <w:b w:val="0"/>
                 <w:sz w:val="18"/>
               </w:rPr>
-              <w:t>23.77</w:t>
+              <w:t>20.3</w:t>
             </w:r>
           </w:p>
         </w:tc>
@@ -9467,7 +9467,7 @@
                 <w:b w:val="0"/>
                 <w:sz w:val="18"/>
               </w:rPr>
-              <w:t>0.0%</w:t>
+              <w:t>100.0%</w:t>
             </w:r>
           </w:p>
         </w:tc>
@@ -9521,7 +9521,7 @@
                 <w:b w:val="0"/>
                 <w:sz w:val="18"/>
               </w:rPr>
-              <w:t>0.00</w:t>
+              <w:t>1097.8</w:t>
             </w:r>
           </w:p>
         </w:tc>
@@ -9548,7 +9548,7 @@
                 <w:b w:val="0"/>
                 <w:sz w:val="18"/>
               </w:rPr>
-              <w:t>0.00</w:t>
+              <w:t>20.3</w:t>
             </w:r>
           </w:p>
         </w:tc>
@@ -9565,7 +9565,7 @@
           <w:color w:val="555555"/>
           <w:sz w:val="17"/>
         </w:rPr>
-        <w:t>数据来源：results/weak_network_simulation/summary_weak_network_simulation.csv。</w:t>
+        <w:t>数据来源：paper_data/05_weak_network.csv。三种协议在统一重试预算下均达到100%成功率。实验为代码级应用层模拟，非tc/netem。</w:t>
       </w:r>
     </w:p>
     <w:p>

</xml_diff>

<commit_message>
fix: paper attacker model, DOCX generator data sync
- Paper: external attacker 3 types (not 6), malicious client 4 types
- Paper: performance section says 4 protocols (not 5)
- DOCX generator: weak network, performance, concurrency numbers from CSV
- DOCX: all old strings verified clean
- 116 tests passing
</commit_message>
<xml_diff>
--- a/paper/GMCP-R_MDPI_Electronics_中文初稿.docx
+++ b/paper/GMCP-R_MDPI_Electronics_中文初稿.docx
@@ -71,7 +71,7 @@
           <w:b w:val="0"/>
           <w:color w:val="000000"/>
         </w:rPr>
-        <w:t>连接恢复并不等同于历史状态恢复。针对断续通信中恢复后历史连续性难以验证的问题，本文提出 GMCP-R（Memory-Continuity-Aware Communication Protocol with Recovery）。该协议结合 memory chain、MemoryTicket 与 Checkpoint：memory chain 将消息内容、序列号、会话上下文和前序记忆状态绑定；MemoryTicket 以服务器认证票据保存 last_seq、last_mem 与 checkpoint 信息；Checkpoint 用于限制恢复时的历史重放范围。基于 Python TCP 原型的实验表明，在测试攻击场景下，GMCP-R 达到 100% 检测率、0% 误接受率和 0% 误拒绝率，五类无效 MemoryTicket 均被拒绝；本地纯计算吞吐量均值为 65,931 msg/s，1 至 20 个并发客户端均保持 100% 成功率，吞吐量峰值为 17,927 msg/s。弱网结果仅来自 preliminary code-level simulation，用于补充观察恢复行为，不作为核心结论。结果说明，GMCP-R 可在可接受开销下为断续通信提供历史连续性验证与安全恢复支持。</w:t>
+        <w:t>连接恢复并不等同于历史状态恢复。针对断续通信中恢复后历史连续性难以验证的问题，本文提出 GMCP-R（Memory-Continuity-Aware Communication Protocol with Recovery）。该协议结合 memory chain、MemoryTicket 与 Checkpoint：memory chain 将消息内容、序列号、会话上下文和前序记忆状态绑定；MemoryTicket 以服务器认证票据保存 last_seq、last_mem 与 checkpoint 信息；Checkpoint 用于限制恢复时的历史重放范围。基于 Python TCP 原型的实验表明，在测试攻击场景下，GMCP-R 达到 100% 检测率、0% 误接受率和 0% 误拒绝率，五类无效 MemoryTicket 均被拒绝；本地纯计算吞吐量均值为 63,998 msg/s，1 至 20 个并发客户端均保持 100% 成功率，吞吐量峰值为 17,244 msg/s。弱网结果仅来自 preliminary code-level simulation，用于补充观察恢复行为，不作为核心结论。结果说明，GMCP-R 可在可接受开销下为断续通信提供历史连续性验证与安全恢复支持。</w:t>
       </w:r>
     </w:p>
     <w:p>
@@ -4788,7 +4788,7 @@
                 <w:b w:val="0"/>
                 <w:sz w:val="18"/>
               </w:rPr>
-              <w:t>drop、modify、replay、prev_mem；票据实验另含 expired、replayed、tampered、rollback、wrong_session</w:t>
+              <w:t>modify_unsigned、metadata_tamper、exact_replay（网络攻击者）；forged_prev_mem_valid_mac、sequence_gap_valid_mac、cross_session_valid_mac、cross_epoch_valid_mac（恶意持钥客户端）；票据实验另含 expired、replayed、tampered、rollback、wrong_session</w:t>
             </w:r>
           </w:p>
         </w:tc>
@@ -7000,7 +7000,7 @@
           <w:b w:val="0"/>
           <w:color w:val="000000"/>
         </w:rPr>
-        <w:t>本地纯计算性能基准测试排除了网络往返影响，主要衡量协议构造、认证和验证逻辑的开销。GMCP-R 的平均吞吐量约为 65,931 msg/s，平均端到端处理延迟约为 14.96 μs。与更轻量的 Ticket Only、Hash Chain 和 Seq+MAC 相比，GMCP-R 的开销主要来自 payload_hash、memory chain 更新、字段覆盖更完整的 HMAC 以及 Checkpoint 管理。</w:t>
+        <w:t>本地纯计算性能基准测试排除了网络往返影响，主要衡量协议构造、认证和验证逻辑的开销。GMCP-R 的平均吞吐量约为 63,998 msg/s，平均端到端处理延迟约为 14.9 μs。与更轻量的 Ticket Only、Hash Chain 和 Seq+MAC 相比，GMCP-R 的开销主要来自 payload_hash、memory chain 更新、字段覆盖更完整的 HMAC 以及 Checkpoint 管理。</w:t>
       </w:r>
     </w:p>
     <w:p>
@@ -7179,7 +7179,7 @@
                 <w:b w:val="0"/>
                 <w:sz w:val="18"/>
               </w:rPr>
-              <w:t>65,931</w:t>
+              <w:t>63,998</w:t>
             </w:r>
           </w:p>
         </w:tc>
@@ -7206,7 +7206,7 @@
                 <w:b w:val="0"/>
                 <w:sz w:val="18"/>
               </w:rPr>
-              <w:t>14.96</w:t>
+              <w:t>14.9</w:t>
             </w:r>
           </w:p>
         </w:tc>
@@ -7846,7 +7846,7 @@
                 <w:b w:val="0"/>
                 <w:sz w:val="18"/>
               </w:rPr>
-              <w:t>7,037</w:t>
+              <w:t>6,754</w:t>
             </w:r>
           </w:p>
         </w:tc>
@@ -7873,7 +7873,7 @@
                 <w:b w:val="0"/>
                 <w:sz w:val="18"/>
               </w:rPr>
-              <w:t>0.125</w:t>
+              <w:t>0.134</w:t>
             </w:r>
           </w:p>
         </w:tc>
@@ -8120,7 +8120,7 @@
                 <w:b w:val="0"/>
                 <w:sz w:val="18"/>
               </w:rPr>
-              <w:t>17,927</w:t>
+              <w:t>17,244</w:t>
             </w:r>
           </w:p>
         </w:tc>
@@ -8147,7 +8147,7 @@
                 <w:b w:val="0"/>
                 <w:sz w:val="18"/>
               </w:rPr>
-              <w:t>0.255</w:t>
+              <w:t>0.309</w:t>
             </w:r>
           </w:p>
         </w:tc>
@@ -8257,7 +8257,7 @@
                 <w:b w:val="0"/>
                 <w:sz w:val="18"/>
               </w:rPr>
-              <w:t>16,452</w:t>
+              <w:t>16,112</w:t>
             </w:r>
           </w:p>
         </w:tc>
@@ -8284,7 +8284,7 @@
                 <w:b w:val="0"/>
                 <w:sz w:val="18"/>
               </w:rPr>
-              <w:t>0.571</w:t>
+              <w:t>0.588</w:t>
             </w:r>
           </w:p>
         </w:tc>
@@ -8394,7 +8394,7 @@
                 <w:b w:val="0"/>
                 <w:sz w:val="18"/>
               </w:rPr>
-              <w:t>15,645</w:t>
+              <w:t>14,699</w:t>
             </w:r>
           </w:p>
         </w:tc>
@@ -8421,7 +8421,7 @@
                 <w:b w:val="0"/>
                 <w:sz w:val="18"/>
               </w:rPr>
-              <w:t>1.216</w:t>
+              <w:t>1.315</w:t>
             </w:r>
           </w:p>
         </w:tc>
@@ -8616,7 +8616,7 @@
           <w:b w:val="0"/>
           <w:color w:val="000000"/>
         </w:rPr>
-        <w:t>并发结果显示，总吞吐量从 1 个客户端的 7,037 msg/s 增至 5 个客户端时的峰值 17,927 msg/s，随后在 10 和 20 个客户端下略有下降。该趋势与 Python 原型中的线程调度、GIL 影响、socket I/O 竞争以及服务端队列等待有关。平均 RTT 从 0.125 ms 上升到 1.216 ms，也反映了并发请求增加后的排队延迟和共享资源竞争。由于各并发级别成功率均为 100%，当前瓶颈主要表现为时延和吞吐变化，而非协议状态错误。</w:t>
+        <w:t>并发结果显示，总吞吐量从 1 个客户端的 6,754 msg/s 增至 5 个客户端时的峰值 17,244 msg/s，随后在 10 和 20 个客户端下略有下降。该趋势可能与服务端实现特性、解释器调度及本地资源竞争等因素有关。平均 RTT 从 0.134 ms 上升到 1.315 ms，也反映了并发请求增加后的排队延迟和共享资源竞争。由于各并发级别成功率均为 100%，当前瓶颈主要表现为时延和吞吐变化，而非协议状态错误。</w:t>
       </w:r>
     </w:p>
     <w:p>
@@ -8859,7 +8859,7 @@
         <w:rPr>
           <w:rFonts w:ascii="Calibri" w:hAnsi="Calibri" w:eastAsia="宋体"/>
         </w:rPr>
-        <w:t>当前攻击场景覆盖 drop、modify、replay、prev_mem 和五类无效票据，仍需扩展到协商降级、选择性篡改、并发恢复竞争等复杂攻击。</w:t>
+        <w:t>当前攻击场景覆盖3类网络攻击（modify_unsigned、metadata_tamper、exact_replay）和4类持钥攻击（forged_prev_mem_valid_mac、sequence_gap_valid_mac、cross_session_valid_mac、cross_epoch_valid_mac）以及五类无效票据，仍需扩展到协商降级、选择性篡改、并发恢复竞争等复杂攻击。</w:t>
       </w:r>
     </w:p>
     <w:p>
@@ -8928,7 +8928,7 @@
           <w:b w:val="0"/>
           <w:color w:val="000000"/>
         </w:rPr>
-        <w:t>基于 Python TCP 原型的实验表明，在测试攻击场景下，GMCP-R 达到 100% 攻击检测率、0% 误接受率与 0% 误拒绝率；五类无效 MemoryTicket 均被拒绝；本地纯计算吞吐量约为 65,931 msg/s；1 至 20 个并发客户端均保持 100% 成功率。初步代码级弱网仿真仅作为补充证据，真实弱网结论仍需进一步验证。后续工作将集中在形式化验证、真实弱网评估、嵌入式资源测量、后量子密钥建立集成和分布式多副本恢复机制上。</w:t>
+        <w:t>基于 Python TCP 原型的实验表明，在测试攻击场景下，GMCP-R 达到 100% 攻击检测率、0% 误接受率与 0% 误拒绝率；五类无效 MemoryTicket 均被拒绝；本地纯计算吞吐量约为 63,998 msg/s；1 至 20 个并发客户端均保持 100% 成功率。初步代码级弱网仿真仅作为补充证据，真实弱网结论仍需进一步验证。后续工作将集中在形式化验证、真实弱网评估、嵌入式资源测量、后量子密钥建立集成和分布式多副本恢复机制上。</w:t>
       </w:r>
     </w:p>
     <w:p>
@@ -9247,7 +9247,7 @@
                 <w:b w:val="0"/>
                 <w:sz w:val="18"/>
               </w:rPr>
-              <w:t>1159.5</w:t>
+              <w:t>417.3</w:t>
             </w:r>
           </w:p>
         </w:tc>
@@ -9274,7 +9274,7 @@
                 <w:b w:val="0"/>
                 <w:sz w:val="18"/>
               </w:rPr>
-              <w:t>20.3</w:t>
+              <w:t>24.8</w:t>
             </w:r>
           </w:p>
         </w:tc>
@@ -9384,7 +9384,7 @@
                 <w:b w:val="0"/>
                 <w:sz w:val="18"/>
               </w:rPr>
-              <w:t>1113.7</w:t>
+              <w:t>519.7</w:t>
             </w:r>
           </w:p>
         </w:tc>
@@ -9411,7 +9411,7 @@
                 <w:b w:val="0"/>
                 <w:sz w:val="18"/>
               </w:rPr>
-              <w:t>20.3</w:t>
+              <w:t>24.8</w:t>
             </w:r>
           </w:p>
         </w:tc>
@@ -9521,7 +9521,7 @@
                 <w:b w:val="0"/>
                 <w:sz w:val="18"/>
               </w:rPr>
-              <w:t>1097.8</w:t>
+              <w:t>487.1</w:t>
             </w:r>
           </w:p>
         </w:tc>
@@ -9548,7 +9548,7 @@
                 <w:b w:val="0"/>
                 <w:sz w:val="18"/>
               </w:rPr>
-              <w:t>20.3</w:t>
+              <w:t>24.8</w:t>
             </w:r>
           </w:p>
         </w:tc>

</xml_diff>